<commit_message>
fix(lab8): restructure report to match classmate examples
- Split combined "1. Цель и задачи" into separate Цель/Постановка задачи
- Add Введение section with 3 paragraphs on Pandas/data analysis
- Add Теоретическая часть with subheadings for each library
- Rename numbered sections (4a–4h) to proper add_subheading() calls
- Add interpretation paragraphs after each visualization figure
- Expand dataset description section with dataset context
- Remove "5." numbering from Вывод heading
- Expand all 3 Вывод paragraphs with more detail

https://claude.ai/code/session_016t7cL8RucnyKRGvr2PKK1V
</commit_message>
<xml_diff>
--- a/mylabs/lab8/report.docx
+++ b/mylabs/lab8/report.docx
@@ -390,7 +390,7 @@
           <w:i w:val="0"/>
           <w:sz w:val="28"/>
         </w:rPr>
-        <w:t xml:space="preserve">1. Цель и задачи: </w:t>
+        <w:t xml:space="preserve">Цель: </w:t>
       </w:r>
       <w:r>
         <w:rPr>
@@ -400,14 +400,14 @@
           <w:i w:val="0"/>
           <w:sz w:val="28"/>
         </w:rPr>
-        <w:t>изучить инструменты анализа данных на языке Python: библиотеки Pandas, Matplotlib, Seaborn и Scikit-learn. В ходе работы необходимо сформировать синтетический датасет о продажах книг, провести его предобработку, построить графики визуализации и обучить модель машинного обучения (Random Forest) для предсказания бестселлеров.</w:t>
+        <w:t>изучить инструменты анализа данных на языке Python — библиотеки Pandas, Matplotlib, Seaborn и Scikit-learn — путём формирования синтетического датасета о продажах книг, его предобработки, построения графиков визуализации и обучения модели машинного обучения (Random Forest) для предсказания бестселлеров.</w:t>
       </w:r>
     </w:p>
     <w:p>
       <w:pPr>
-        <w:spacing w:before="160" w:after="80" w:line="360" w:lineRule="auto"/>
-        <w:ind w:firstLine="0"/>
-        <w:jc w:val="left"/>
+        <w:spacing w:line="360" w:lineRule="auto"/>
+        <w:ind w:firstLine="709"/>
+        <w:jc w:val="both"/>
       </w:pPr>
       <w:r>
         <w:rPr>
@@ -417,24 +417,7 @@
           <w:i w:val="0"/>
           <w:sz w:val="28"/>
         </w:rPr>
-        <w:t>2. Описание библиотек</w:t>
-      </w:r>
-    </w:p>
-    <w:p>
-      <w:pPr>
-        <w:spacing w:line="360" w:lineRule="auto"/>
-        <w:ind w:firstLine="0" w:left="709"/>
-        <w:jc w:val="both"/>
-      </w:pPr>
-      <w:r>
-        <w:rPr>
-          <w:rFonts w:ascii="Times New Roman" w:hAnsi="Times New Roman" w:cs="Times New Roman"/>
-          <w:rFonts w:ascii="Times New Roman" w:hAnsi="Times New Roman"/>
-          <w:b/>
-          <w:i w:val="0"/>
-          <w:sz w:val="28"/>
-        </w:rPr>
-        <w:t xml:space="preserve">Pandas — </w:t>
+        <w:t xml:space="preserve">Постановка задачи: </w:t>
       </w:r>
       <w:r>
         <w:rPr>
@@ -444,14 +427,167 @@
           <w:i w:val="0"/>
           <w:sz w:val="28"/>
         </w:rPr>
-        <w:t>библиотека для работы с табличными данными (DataFrame). Поддерживает загрузку CSV/Excel, фильтрацию, агрегацию, обработку пропусков;</w:t>
+        <w:t>для достижения цели необходимо выполнить следующие задачи:</w:t>
       </w:r>
     </w:p>
     <w:p>
       <w:pPr>
+        <w:pStyle w:val="ListBullet"/>
         <w:spacing w:line="360" w:lineRule="auto"/>
-        <w:ind w:firstLine="0" w:left="709"/>
         <w:jc w:val="both"/>
+      </w:pPr>
+      <w:r>
+        <w:rPr>
+          <w:rFonts w:ascii="Times New Roman" w:hAnsi="Times New Roman" w:cs="Times New Roman"/>
+          <w:rFonts w:ascii="Times New Roman" w:hAnsi="Times New Roman"/>
+          <w:b w:val="0"/>
+          <w:i w:val="0"/>
+          <w:sz w:val="28"/>
+        </w:rPr>
+        <w:t>изучить возможности библиотек Pandas, Matplotlib, Seaborn и Scikit-learn;</w:t>
+      </w:r>
+    </w:p>
+    <w:p>
+      <w:pPr>
+        <w:pStyle w:val="ListBullet"/>
+        <w:spacing w:line="360" w:lineRule="auto"/>
+        <w:jc w:val="both"/>
+      </w:pPr>
+      <w:r>
+        <w:rPr>
+          <w:rFonts w:ascii="Times New Roman" w:hAnsi="Times New Roman" w:cs="Times New Roman"/>
+          <w:rFonts w:ascii="Times New Roman" w:hAnsi="Times New Roman"/>
+          <w:b w:val="0"/>
+          <w:i w:val="0"/>
+          <w:sz w:val="28"/>
+        </w:rPr>
+        <w:t>сформировать синтетический датасет о продажах книжного магазина (220 строк, 10 признаков);</w:t>
+      </w:r>
+    </w:p>
+    <w:p>
+      <w:pPr>
+        <w:pStyle w:val="ListBullet"/>
+        <w:spacing w:line="360" w:lineRule="auto"/>
+        <w:jc w:val="both"/>
+      </w:pPr>
+      <w:r>
+        <w:rPr>
+          <w:rFonts w:ascii="Times New Roman" w:hAnsi="Times New Roman" w:cs="Times New Roman"/>
+          <w:rFonts w:ascii="Times New Roman" w:hAnsi="Times New Roman"/>
+          <w:b w:val="0"/>
+          <w:i w:val="0"/>
+          <w:sz w:val="28"/>
+        </w:rPr>
+        <w:t>провести базовый анализ данных: просмотр структуры, типов, пропущенных значений и статистик;</w:t>
+      </w:r>
+    </w:p>
+    <w:p>
+      <w:pPr>
+        <w:pStyle w:val="ListBullet"/>
+        <w:spacing w:line="360" w:lineRule="auto"/>
+        <w:jc w:val="both"/>
+      </w:pPr>
+      <w:r>
+        <w:rPr>
+          <w:rFonts w:ascii="Times New Roman" w:hAnsi="Times New Roman" w:cs="Times New Roman"/>
+          <w:rFonts w:ascii="Times New Roman" w:hAnsi="Times New Roman"/>
+          <w:b w:val="0"/>
+          <w:i w:val="0"/>
+          <w:sz w:val="28"/>
+        </w:rPr>
+        <w:t>выполнить предобработку данных: заполнение пропусков медианой, проверку дубликатов;</w:t>
+      </w:r>
+    </w:p>
+    <w:p>
+      <w:pPr>
+        <w:pStyle w:val="ListBullet"/>
+        <w:spacing w:line="360" w:lineRule="auto"/>
+        <w:jc w:val="both"/>
+      </w:pPr>
+      <w:r>
+        <w:rPr>
+          <w:rFonts w:ascii="Times New Roman" w:hAnsi="Times New Roman" w:cs="Times New Roman"/>
+          <w:rFonts w:ascii="Times New Roman" w:hAnsi="Times New Roman"/>
+          <w:b w:val="0"/>
+          <w:i w:val="0"/>
+          <w:sz w:val="28"/>
+        </w:rPr>
+        <w:t>построить корреляционную тепловую карту (heatmap) числовых признаков;</w:t>
+      </w:r>
+    </w:p>
+    <w:p>
+      <w:pPr>
+        <w:pStyle w:val="ListBullet"/>
+        <w:spacing w:line="360" w:lineRule="auto"/>
+        <w:jc w:val="both"/>
+      </w:pPr>
+      <w:r>
+        <w:rPr>
+          <w:rFonts w:ascii="Times New Roman" w:hAnsi="Times New Roman" w:cs="Times New Roman"/>
+          <w:rFonts w:ascii="Times New Roman" w:hAnsi="Times New Roman"/>
+          <w:b w:val="0"/>
+          <w:i w:val="0"/>
+          <w:sz w:val="28"/>
+        </w:rPr>
+        <w:t>построить диаграмму рассеяния (scatter plot) «цена vs продажи» с раскраской по жанру;</w:t>
+      </w:r>
+    </w:p>
+    <w:p>
+      <w:pPr>
+        <w:pStyle w:val="ListBullet"/>
+        <w:spacing w:line="360" w:lineRule="auto"/>
+        <w:jc w:val="both"/>
+      </w:pPr>
+      <w:r>
+        <w:rPr>
+          <w:rFonts w:ascii="Times New Roman" w:hAnsi="Times New Roman" w:cs="Times New Roman"/>
+          <w:rFonts w:ascii="Times New Roman" w:hAnsi="Times New Roman"/>
+          <w:b w:val="0"/>
+          <w:i w:val="0"/>
+          <w:sz w:val="28"/>
+        </w:rPr>
+        <w:t>построить ящик с усами (boxplot) для сравнения продаж по жанрам;</w:t>
+      </w:r>
+    </w:p>
+    <w:p>
+      <w:pPr>
+        <w:pStyle w:val="ListBullet"/>
+        <w:spacing w:line="360" w:lineRule="auto"/>
+        <w:jc w:val="both"/>
+      </w:pPr>
+      <w:r>
+        <w:rPr>
+          <w:rFonts w:ascii="Times New Roman" w:hAnsi="Times New Roman" w:cs="Times New Roman"/>
+          <w:rFonts w:ascii="Times New Roman" w:hAnsi="Times New Roman"/>
+          <w:b w:val="0"/>
+          <w:i w:val="0"/>
+          <w:sz w:val="28"/>
+        </w:rPr>
+        <w:t>построить KDE-график распределения рейтинга для бестселлеров и обычных книг;</w:t>
+      </w:r>
+    </w:p>
+    <w:p>
+      <w:pPr>
+        <w:pStyle w:val="ListBullet"/>
+        <w:spacing w:line="360" w:lineRule="auto"/>
+        <w:jc w:val="both"/>
+      </w:pPr>
+      <w:r>
+        <w:rPr>
+          <w:rFonts w:ascii="Times New Roman" w:hAnsi="Times New Roman" w:cs="Times New Roman"/>
+          <w:rFonts w:ascii="Times New Roman" w:hAnsi="Times New Roman"/>
+          <w:b w:val="0"/>
+          <w:i w:val="0"/>
+          <w:sz w:val="28"/>
+        </w:rPr>
+        <w:t>обучить классификатор Random Forest для предсказания бестселлеров и оценить его точность.</w:t>
+      </w:r>
+    </w:p>
+    <w:p>
+      <w:pPr>
+        <w:spacing w:before="160" w:after="80" w:line="360" w:lineRule="auto"/>
+        <w:ind w:firstLine="0"/>
+        <w:jc w:val="left"/>
       </w:pPr>
       <w:r>
         <w:rPr>
@@ -461,8 +597,15 @@
           <w:i w:val="0"/>
           <w:sz w:val="28"/>
         </w:rPr>
-        <w:t xml:space="preserve">Matplotlib — </w:t>
+        <w:t>Введение</w:t>
       </w:r>
+    </w:p>
+    <w:p>
+      <w:pPr>
+        <w:spacing w:before="0" w:after="0" w:line="360" w:lineRule="auto"/>
+        <w:ind w:firstLine="709"/>
+        <w:jc w:val="both"/>
+      </w:pPr>
       <w:r>
         <w:rPr>
           <w:rFonts w:ascii="Times New Roman" w:hAnsi="Times New Roman" w:cs="Times New Roman"/>
@@ -471,14 +614,48 @@
           <w:i w:val="0"/>
           <w:sz w:val="28"/>
         </w:rPr>
-        <w:t>базовая библиотека визуализации в Python. Позволяет строить любые типы графиков (scatter, bar, line, box и др.);</w:t>
+        <w:t>Анализ данных является одним из ключевых навыков в современной разработке программного обеспечения и науке о данных. Организации накапливают огромные массивы информации о продажах, клиентах и продуктах, которые требуют систематической обработки и интерпретации. Язык Python, благодаря развитой экосистеме библиотек, стал основным инструментом для решения задач разведочного анализа данных (EDA) и построения прогностических моделей.</w:t>
       </w:r>
     </w:p>
     <w:p>
       <w:pPr>
-        <w:spacing w:line="360" w:lineRule="auto"/>
-        <w:ind w:firstLine="0" w:left="709"/>
+        <w:spacing w:before="0" w:after="0" w:line="360" w:lineRule="auto"/>
+        <w:ind w:firstLine="709"/>
         <w:jc w:val="both"/>
+      </w:pPr>
+      <w:r>
+        <w:rPr>
+          <w:rFonts w:ascii="Times New Roman" w:hAnsi="Times New Roman" w:cs="Times New Roman"/>
+          <w:rFonts w:ascii="Times New Roman" w:hAnsi="Times New Roman"/>
+          <w:b w:val="0"/>
+          <w:i w:val="0"/>
+          <w:sz w:val="28"/>
+        </w:rPr>
+        <w:t>Библиотека Pandas предоставляет мощный инструментарий для работы с табличными данными через структуру DataFrame: загрузку из CSV/Excel, фильтрацию, группировку и агрегацию. Matplotlib и Seaborn обеспечивают построение широкого спектра статистических визуализаций — от простых гистограмм до сложных тепловых карт. Scikit-learn предоставляет унифицированный интерфейс для применения алгоритмов машинного обучения, включая классификаторы, регрессоры и инструменты предобработки.</w:t>
+      </w:r>
+    </w:p>
+    <w:p>
+      <w:pPr>
+        <w:spacing w:before="0" w:after="0" w:line="360" w:lineRule="auto"/>
+        <w:ind w:firstLine="709"/>
+        <w:jc w:val="both"/>
+      </w:pPr>
+      <w:r>
+        <w:rPr>
+          <w:rFonts w:ascii="Times New Roman" w:hAnsi="Times New Roman" w:cs="Times New Roman"/>
+          <w:rFonts w:ascii="Times New Roman" w:hAnsi="Times New Roman"/>
+          <w:b w:val="0"/>
+          <w:i w:val="0"/>
+          <w:sz w:val="28"/>
+        </w:rPr>
+        <w:t>В данной лабораторной работе в качестве предметной области выбран книжный магазин. Сформированный синтетический датасет содержит информацию о жанре, цене, рейтинге и количестве продаж книг. Целевым признаком является бинарный флаг бестселлера. Такая постановка задачи позволяет продемонстрировать полный цикл работы с данными: от генерации и предобработки до визуализации и построения классификационной модели.</w:t>
+      </w:r>
+    </w:p>
+    <w:p>
+      <w:pPr>
+        <w:spacing w:before="160" w:after="80" w:line="360" w:lineRule="auto"/>
+        <w:ind w:firstLine="0"/>
+        <w:jc w:val="left"/>
       </w:pPr>
       <w:r>
         <w:rPr>
@@ -488,8 +665,32 @@
           <w:i w:val="0"/>
           <w:sz w:val="28"/>
         </w:rPr>
-        <w:t xml:space="preserve">Seaborn — </w:t>
+        <w:t>Теоретическая часть</w:t>
       </w:r>
+    </w:p>
+    <w:p>
+      <w:pPr>
+        <w:spacing w:before="120" w:after="40" w:line="360" w:lineRule="auto"/>
+        <w:ind w:firstLine="709"/>
+        <w:jc w:val="left"/>
+      </w:pPr>
+      <w:r>
+        <w:rPr>
+          <w:rFonts w:ascii="Times New Roman" w:hAnsi="Times New Roman" w:cs="Times New Roman"/>
+          <w:rFonts w:ascii="Times New Roman" w:hAnsi="Times New Roman"/>
+          <w:b/>
+          <w:i/>
+          <w:sz w:val="28"/>
+        </w:rPr>
+        <w:t>Библиотека Pandas</w:t>
+      </w:r>
+    </w:p>
+    <w:p>
+      <w:pPr>
+        <w:spacing w:before="0" w:after="0" w:line="360" w:lineRule="auto"/>
+        <w:ind w:firstLine="709"/>
+        <w:jc w:val="both"/>
+      </w:pPr>
       <w:r>
         <w:rPr>
           <w:rFonts w:ascii="Times New Roman" w:hAnsi="Times New Roman" w:cs="Times New Roman"/>
@@ -498,14 +699,82 @@
           <w:i w:val="0"/>
           <w:sz w:val="28"/>
         </w:rPr>
-        <w:t>высокоуровневая библиотека визуализации на основе Matplotlib. Предоставляет готовые статистические графики (heatmap, boxplot, kdeplot);</w:t>
+        <w:t>Pandas — это библиотека с открытым исходным кодом для языка Python, предназначенная для работы с табличными и временными рядами данных. Основной структурой данных является DataFrame — двумерная таблица с именованными столбцами и индексами. Pandas поддерживает чтение и запись данных из форматов CSV, Excel, JSON, SQL; фильтрацию, сортировку и группировку строк; обработку пропущенных значений (NaN); объединение таблиц (merge, join, concat). Метод describe() позволяет получить сводную статистику: среднее, медиану, квартили и стандартное отклонение для всех числовых столбцов.</w:t>
       </w:r>
     </w:p>
     <w:p>
       <w:pPr>
-        <w:spacing w:line="360" w:lineRule="auto"/>
-        <w:ind w:firstLine="0" w:left="709"/>
+        <w:spacing w:before="120" w:after="40" w:line="360" w:lineRule="auto"/>
+        <w:ind w:firstLine="709"/>
+        <w:jc w:val="left"/>
+      </w:pPr>
+      <w:r>
+        <w:rPr>
+          <w:rFonts w:ascii="Times New Roman" w:hAnsi="Times New Roman" w:cs="Times New Roman"/>
+          <w:rFonts w:ascii="Times New Roman" w:hAnsi="Times New Roman"/>
+          <w:b/>
+          <w:i/>
+          <w:sz w:val="28"/>
+        </w:rPr>
+        <w:t>Библиотеки Matplotlib и Seaborn</w:t>
+      </w:r>
+    </w:p>
+    <w:p>
+      <w:pPr>
+        <w:spacing w:before="0" w:after="0" w:line="360" w:lineRule="auto"/>
+        <w:ind w:firstLine="709"/>
         <w:jc w:val="both"/>
+      </w:pPr>
+      <w:r>
+        <w:rPr>
+          <w:rFonts w:ascii="Times New Roman" w:hAnsi="Times New Roman" w:cs="Times New Roman"/>
+          <w:rFonts w:ascii="Times New Roman" w:hAnsi="Times New Roman"/>
+          <w:b w:val="0"/>
+          <w:i w:val="0"/>
+          <w:sz w:val="28"/>
+        </w:rPr>
+        <w:t>Matplotlib — базовая библиотека для построения графиков в Python. Она позволяет создавать практически любые типы визуализаций: линейные графики, гистограммы, диаграммы рассеяния, круговые диаграммы. Seaborn является высокоуровневой надстройкой над Matplotlib и предоставляет удобный интерфейс для построения статистических графиков. Функция heatmap() строит тепловую карту матрицы, kdeplot() — оценку плотности распределения (KDE), boxplot() — ящик с усами. Seaborn автоматически интегрируется с DataFrame Pandas, что существенно упрощает построение графиков.</w:t>
+      </w:r>
+    </w:p>
+    <w:p>
+      <w:pPr>
+        <w:spacing w:before="120" w:after="40" w:line="360" w:lineRule="auto"/>
+        <w:ind w:firstLine="709"/>
+        <w:jc w:val="left"/>
+      </w:pPr>
+      <w:r>
+        <w:rPr>
+          <w:rFonts w:ascii="Times New Roman" w:hAnsi="Times New Roman" w:cs="Times New Roman"/>
+          <w:rFonts w:ascii="Times New Roman" w:hAnsi="Times New Roman"/>
+          <w:b/>
+          <w:i/>
+          <w:sz w:val="28"/>
+        </w:rPr>
+        <w:t>Библиотека Scikit-learn и алгоритм Random Forest</w:t>
+      </w:r>
+    </w:p>
+    <w:p>
+      <w:pPr>
+        <w:spacing w:before="0" w:after="0" w:line="360" w:lineRule="auto"/>
+        <w:ind w:firstLine="709"/>
+        <w:jc w:val="both"/>
+      </w:pPr>
+      <w:r>
+        <w:rPr>
+          <w:rFonts w:ascii="Times New Roman" w:hAnsi="Times New Roman" w:cs="Times New Roman"/>
+          <w:rFonts w:ascii="Times New Roman" w:hAnsi="Times New Roman"/>
+          <w:b w:val="0"/>
+          <w:i w:val="0"/>
+          <w:sz w:val="28"/>
+        </w:rPr>
+        <w:t>Scikit-learn — ведущая библиотека машинного обучения для Python. Она предоставляет унифицированный интерфейс fit/predict для всех алгоритмов, что упрощает замену и сравнение моделей. Random Forest (случайный лес) — ансамблевый алгоритм, строящий множество решающих деревьев и объединяющий их предсказания голосованием. Преимущества метода: устойчивость к переобучению, встроенная оценка важности признаков (feature_importances_), работа с категориальными признаками после кодирования LabelEncoder. Качество классификации оценивается метриками accuracy (доля верных ответов) и classification_report (precision, recall, F1).</w:t>
+      </w:r>
+    </w:p>
+    <w:p>
+      <w:pPr>
+        <w:spacing w:before="160" w:after="80" w:line="360" w:lineRule="auto"/>
+        <w:ind w:firstLine="0"/>
+        <w:jc w:val="left"/>
       </w:pPr>
       <w:r>
         <w:rPr>
@@ -515,8 +784,15 @@
           <w:i w:val="0"/>
           <w:sz w:val="28"/>
         </w:rPr>
-        <w:t xml:space="preserve">Scikit-learn — </w:t>
+        <w:t>Описание датасета</w:t>
       </w:r>
+    </w:p>
+    <w:p>
+      <w:pPr>
+        <w:spacing w:before="0" w:after="0" w:line="360" w:lineRule="auto"/>
+        <w:ind w:firstLine="709"/>
+        <w:jc w:val="both"/>
+      </w:pPr>
       <w:r>
         <w:rPr>
           <w:rFonts w:ascii="Times New Roman" w:hAnsi="Times New Roman" w:cs="Times New Roman"/>
@@ -525,41 +801,7 @@
           <w:i w:val="0"/>
           <w:sz w:val="28"/>
         </w:rPr>
-        <w:t>библиотека машинного обучения. Содержит алгоритмы классификации, регрессии, кластеризации, а также инструменты предобработки и оценки моделей.</w:t>
-      </w:r>
-    </w:p>
-    <w:p>
-      <w:pPr>
-        <w:spacing w:before="160" w:after="80" w:line="360" w:lineRule="auto"/>
-        <w:ind w:firstLine="0"/>
-        <w:jc w:val="left"/>
-      </w:pPr>
-      <w:r>
-        <w:rPr>
-          <w:rFonts w:ascii="Times New Roman" w:hAnsi="Times New Roman" w:cs="Times New Roman"/>
-          <w:rFonts w:ascii="Times New Roman" w:hAnsi="Times New Roman"/>
-          <w:b/>
-          <w:i w:val="0"/>
-          <w:sz w:val="28"/>
-        </w:rPr>
-        <w:t>3. Описание датасета</w:t>
-      </w:r>
-    </w:p>
-    <w:p>
-      <w:pPr>
-        <w:spacing w:before="0" w:after="0" w:line="360" w:lineRule="auto"/>
-        <w:ind w:firstLine="709"/>
-        <w:jc w:val="both"/>
-      </w:pPr>
-      <w:r>
-        <w:rPr>
-          <w:rFonts w:ascii="Times New Roman" w:hAnsi="Times New Roman" w:cs="Times New Roman"/>
-          <w:rFonts w:ascii="Times New Roman" w:hAnsi="Times New Roman"/>
-          <w:b w:val="0"/>
-          <w:i w:val="0"/>
-          <w:sz w:val="28"/>
-        </w:rPr>
-        <w:t>Для выполнения работы сформирован синтетический датасет о продажах книг в книжном магазине. Датасет содержит 220 строк и 10 признаков:</w:t>
+        <w:t>Для выполнения работы сформирован синтетический датасет о продажах книг в книжном магазине. Датасет содержит 220 строк и 10 признаков. Данные сгенерированы с фиксированным зерном случайности (seed=42) для воспроизводимости результатов. Количество продаж зависит от жанра, рейтинга и цены книги. Намеренно введены пропущенные значения (~5% в столбце pages, ~4% в author_rating) для отработки предобработки:</w:t>
       </w:r>
     </w:p>
     <w:p>
@@ -1328,13 +1570,13 @@
           <w:i w:val="0"/>
           <w:sz w:val="28"/>
         </w:rPr>
-        <w:t>4. Практическая реализация</w:t>
+        <w:t>Реализация</w:t>
       </w:r>
     </w:p>
     <w:p>
       <w:pPr>
-        <w:spacing w:before="160" w:after="80" w:line="360" w:lineRule="auto"/>
-        <w:ind w:firstLine="0"/>
+        <w:spacing w:before="120" w:after="40" w:line="360" w:lineRule="auto"/>
+        <w:ind w:firstLine="709"/>
         <w:jc w:val="left"/>
       </w:pPr>
       <w:r>
@@ -1342,10 +1584,10 @@
           <w:rFonts w:ascii="Times New Roman" w:hAnsi="Times New Roman" w:cs="Times New Roman"/>
           <w:rFonts w:ascii="Times New Roman" w:hAnsi="Times New Roman"/>
           <w:b/>
-          <w:i w:val="0"/>
+          <w:i/>
           <w:sz w:val="28"/>
         </w:rPr>
-        <w:t>4a. Генерация и загрузка данных</w:t>
+        <w:t>Генерация и загрузка данных</w:t>
       </w:r>
     </w:p>
     <w:p>
@@ -1362,7 +1604,7 @@
           <w:i w:val="0"/>
           <w:sz w:val="28"/>
         </w:rPr>
-        <w:t>Датасет сгенерирован с помощью numpy.random.default_rng (seed=42) для воспроизводимости. Продажи зависят от жанра (мультипликатор), рейтинга и цены. Намеренно введены пропуски для отработки предобработки:</w:t>
+        <w:t>Датасет сгенерирован с помощью numpy.random.default_rng (seed=42) для воспроизводимости. Количество продаж рассчитывается через формулу, учитывающую жанровый мультипликатор, рейтинг и цену книги. После генерации данные сохраняются в CSV и загружаются обратно через Pandas, что имитирует реальный сценарий работы с файловыми источниками данных:</w:t>
       </w:r>
     </w:p>
     <w:p>
@@ -2242,8 +2484,8 @@
     </w:p>
     <w:p>
       <w:pPr>
-        <w:spacing w:before="160" w:after="80" w:line="360" w:lineRule="auto"/>
-        <w:ind w:firstLine="0"/>
+        <w:spacing w:before="120" w:after="40" w:line="360" w:lineRule="auto"/>
+        <w:ind w:firstLine="709"/>
         <w:jc w:val="left"/>
       </w:pPr>
       <w:r>
@@ -2251,10 +2493,10 @@
           <w:rFonts w:ascii="Times New Roman" w:hAnsi="Times New Roman" w:cs="Times New Roman"/>
           <w:rFonts w:ascii="Times New Roman" w:hAnsi="Times New Roman"/>
           <w:b/>
-          <w:i w:val="0"/>
+          <w:i/>
           <w:sz w:val="28"/>
         </w:rPr>
-        <w:t>4b. Структура датасета</w:t>
+        <w:t>Базовый анализ структуры датасета</w:t>
       </w:r>
     </w:p>
     <w:p>
@@ -2271,7 +2513,7 @@
           <w:i w:val="0"/>
           <w:sz w:val="28"/>
         </w:rPr>
-        <w:t>Вывод df.head(), df.shape, df.info(), df.isnull().sum():</w:t>
+        <w:t>Первым шагом анализа является изучение структуры датасета: размерности, типов данных и наличия пропущенных значений. Методы df.head(), df.shape, df.info() и df.isnull().sum() дают полное представление о составе данных. Метод df.describe() выводит статистику по числовым столбцам: count, mean, std, min, 25%, 50%, 75%, max:</w:t>
       </w:r>
     </w:p>
     <w:p>
@@ -2816,24 +3058,7 @@
           <w:i/>
           <w:sz w:val="24"/>
         </w:rPr>
-        <w:t>Рис. 2. Базовый анализ: форма, типы данных, пропуски, статистика</w:t>
-      </w:r>
-    </w:p>
-    <w:p>
-      <w:pPr>
-        <w:spacing w:before="160" w:after="80" w:line="360" w:lineRule="auto"/>
-        <w:ind w:firstLine="0"/>
-        <w:jc w:val="left"/>
-      </w:pPr>
-      <w:r>
-        <w:rPr>
-          <w:rFonts w:ascii="Times New Roman" w:hAnsi="Times New Roman" w:cs="Times New Roman"/>
-          <w:rFonts w:ascii="Times New Roman" w:hAnsi="Times New Roman"/>
-          <w:b/>
-          <w:i w:val="0"/>
-          <w:sz w:val="28"/>
-        </w:rPr>
-        <w:t>4c. Предобработка данных</w:t>
+        <w:t>Рис. 2. Вывод базового анализа: форма, типы данных, пропуски, статистика</w:t>
       </w:r>
     </w:p>
     <w:p>
@@ -2850,7 +3075,41 @@
           <w:i w:val="0"/>
           <w:sz w:val="28"/>
         </w:rPr>
-        <w:t>Пропущенные значения заполняются медианой по соответствующему столбцу. Медиана выбрана вместо среднего как устойчивая к выбросам характеристика:</w:t>
+        <w:t>Из вывода видно, что датасет содержит 220 строк и 10 столбцов. Обнаружены пропущенные значения: 11 в столбце pages (5.0%) и 8 в author_rating (3.6%). Средняя цена книги составляет 699 рублей, средний рейтинг — 3.76 из 5.0. Дубликаты строк отсутствуют.</w:t>
+      </w:r>
+    </w:p>
+    <w:p>
+      <w:pPr>
+        <w:spacing w:before="120" w:after="40" w:line="360" w:lineRule="auto"/>
+        <w:ind w:firstLine="709"/>
+        <w:jc w:val="left"/>
+      </w:pPr>
+      <w:r>
+        <w:rPr>
+          <w:rFonts w:ascii="Times New Roman" w:hAnsi="Times New Roman" w:cs="Times New Roman"/>
+          <w:rFonts w:ascii="Times New Roman" w:hAnsi="Times New Roman"/>
+          <w:b/>
+          <w:i/>
+          <w:sz w:val="28"/>
+        </w:rPr>
+        <w:t>Предобработка данных</w:t>
+      </w:r>
+    </w:p>
+    <w:p>
+      <w:pPr>
+        <w:spacing w:before="0" w:after="0" w:line="360" w:lineRule="auto"/>
+        <w:ind w:firstLine="709"/>
+        <w:jc w:val="both"/>
+      </w:pPr>
+      <w:r>
+        <w:rPr>
+          <w:rFonts w:ascii="Times New Roman" w:hAnsi="Times New Roman" w:cs="Times New Roman"/>
+          <w:rFonts w:ascii="Times New Roman" w:hAnsi="Times New Roman"/>
+          <w:b w:val="0"/>
+          <w:i w:val="0"/>
+          <w:sz w:val="28"/>
+        </w:rPr>
+        <w:t>Пропущенные значения заполняются медианой по соответствующему столбцу. Медиана выбрана вместо среднего арифметического как мера, устойчивая к выбросам: при наличии аномальных значений среднее смещается, медиана же остаётся стабильной. После заполнения проверяется отсутствие дубликатов строк:</w:t>
       </w:r>
     </w:p>
     <w:p>
@@ -3131,24 +3390,7 @@
           <w:i/>
           <w:sz w:val="24"/>
         </w:rPr>
-        <w:t>Рис. 3. Предобработка: заполнение пропусков и проверка дубликатов</w:t>
-      </w:r>
-    </w:p>
-    <w:p>
-      <w:pPr>
-        <w:spacing w:before="160" w:after="80" w:line="360" w:lineRule="auto"/>
-        <w:ind w:firstLine="0"/>
-        <w:jc w:val="left"/>
-      </w:pPr>
-      <w:r>
-        <w:rPr>
-          <w:rFonts w:ascii="Times New Roman" w:hAnsi="Times New Roman" w:cs="Times New Roman"/>
-          <w:rFonts w:ascii="Times New Roman" w:hAnsi="Times New Roman"/>
-          <w:b/>
-          <w:i w:val="0"/>
-          <w:sz w:val="28"/>
-        </w:rPr>
-        <w:t>4d. Корреляционная тепловая карта</w:t>
+        <w:t>Рис. 3. Предобработка: заполнение пропусков медианой и проверка дубликатов</w:t>
       </w:r>
     </w:p>
     <w:p>
@@ -3165,7 +3407,41 @@
           <w:i w:val="0"/>
           <w:sz w:val="28"/>
         </w:rPr>
-        <w:t>Корреляционная матрица Пирсона для числовых признаков позволяет выявить взаимосвязи между переменными. Ключевые наблюдения: sales_count сильно коррелирует с is_bestseller (0.83); price отрицательно коррелирует с sales_count (-0.42).</w:t>
+        <w:t>В результате предобработки все 11 пропусков в столбце pages заполнены медианным значением 487.0, а 8 пропусков в author_rating — значением 3.5. Датасет готов к визуализации и машинному обучению.</w:t>
+      </w:r>
+    </w:p>
+    <w:p>
+      <w:pPr>
+        <w:spacing w:before="120" w:after="40" w:line="360" w:lineRule="auto"/>
+        <w:ind w:firstLine="709"/>
+        <w:jc w:val="left"/>
+      </w:pPr>
+      <w:r>
+        <w:rPr>
+          <w:rFonts w:ascii="Times New Roman" w:hAnsi="Times New Roman" w:cs="Times New Roman"/>
+          <w:rFonts w:ascii="Times New Roman" w:hAnsi="Times New Roman"/>
+          <w:b/>
+          <w:i/>
+          <w:sz w:val="28"/>
+        </w:rPr>
+        <w:t>Корреляционная тепловая карта</w:t>
+      </w:r>
+    </w:p>
+    <w:p>
+      <w:pPr>
+        <w:spacing w:before="0" w:after="0" w:line="360" w:lineRule="auto"/>
+        <w:ind w:firstLine="709"/>
+        <w:jc w:val="both"/>
+      </w:pPr>
+      <w:r>
+        <w:rPr>
+          <w:rFonts w:ascii="Times New Roman" w:hAnsi="Times New Roman" w:cs="Times New Roman"/>
+          <w:rFonts w:ascii="Times New Roman" w:hAnsi="Times New Roman"/>
+          <w:b w:val="0"/>
+          <w:i w:val="0"/>
+          <w:sz w:val="28"/>
+        </w:rPr>
+        <w:t>Корреляционная матрица Пирсона позволяет количественно оценить линейные взаимосвязи между числовыми признаками. Значения близкие к +1 указывают на сильную прямую зависимость, к -1 — на обратную. Тепловая карта визуализирует матрицу с цветовой кодировкой, что упрощает интерпретацию:</w:t>
       </w:r>
     </w:p>
     <w:p>
@@ -3495,23 +3771,6 @@
     </w:p>
     <w:p>
       <w:pPr>
-        <w:spacing w:before="160" w:after="80" w:line="360" w:lineRule="auto"/>
-        <w:ind w:firstLine="0"/>
-        <w:jc w:val="left"/>
-      </w:pPr>
-      <w:r>
-        <w:rPr>
-          <w:rFonts w:ascii="Times New Roman" w:hAnsi="Times New Roman" w:cs="Times New Roman"/>
-          <w:rFonts w:ascii="Times New Roman" w:hAnsi="Times New Roman"/>
-          <w:b/>
-          <w:i w:val="0"/>
-          <w:sz w:val="28"/>
-        </w:rPr>
-        <w:t>4e. Диаграмма рассеяния (scatter)</w:t>
-      </w:r>
-    </w:p>
-    <w:p>
-      <w:pPr>
         <w:spacing w:before="0" w:after="0" w:line="360" w:lineRule="auto"/>
         <w:ind w:firstLine="709"/>
         <w:jc w:val="both"/>
@@ -3524,7 +3783,41 @@
           <w:i w:val="0"/>
           <w:sz w:val="28"/>
         </w:rPr>
-        <w:t>Диаграмма рассеяния «цена vs количество продаж» с раскраской по жанру демонстрирует обратную зависимость: при росте цены количество продаж, как правило, снижается. Фантастика и детективы продаются лучше при аналогичных ценах.</w:t>
+        <w:t>Анализ тепловой карты выявляет следующие закономерности: признак sales_count имеет сильную положительную корреляцию с is_bestseller (0.83), что ожидаемо — бестселлер определяется именно по объёму продаж. Цена (price) отрицательно коррелирует с количеством продаж (-0.42): дорогие книги продаются в меньшем количестве. Рейтинг (rating) слабо коррелирует с продажами, что может объясняться жанровыми различиями в аудитории.</w:t>
+      </w:r>
+    </w:p>
+    <w:p>
+      <w:pPr>
+        <w:spacing w:before="120" w:after="40" w:line="360" w:lineRule="auto"/>
+        <w:ind w:firstLine="709"/>
+        <w:jc w:val="left"/>
+      </w:pPr>
+      <w:r>
+        <w:rPr>
+          <w:rFonts w:ascii="Times New Roman" w:hAnsi="Times New Roman" w:cs="Times New Roman"/>
+          <w:rFonts w:ascii="Times New Roman" w:hAnsi="Times New Roman"/>
+          <w:b/>
+          <w:i/>
+          <w:sz w:val="28"/>
+        </w:rPr>
+        <w:t>Диаграмма рассеяния (scatter plot)</w:t>
+      </w:r>
+    </w:p>
+    <w:p>
+      <w:pPr>
+        <w:spacing w:before="0" w:after="0" w:line="360" w:lineRule="auto"/>
+        <w:ind w:firstLine="709"/>
+        <w:jc w:val="both"/>
+      </w:pPr>
+      <w:r>
+        <w:rPr>
+          <w:rFonts w:ascii="Times New Roman" w:hAnsi="Times New Roman" w:cs="Times New Roman"/>
+          <w:rFonts w:ascii="Times New Roman" w:hAnsi="Times New Roman"/>
+          <w:b w:val="0"/>
+          <w:i w:val="0"/>
+          <w:sz w:val="28"/>
+        </w:rPr>
+        <w:t>Диаграмма рассеяния «цена vs количество продаж» с раскраской точек по жанру позволяет визуально оценить распределение данных и выявить кластеры. Каждая точка соответствует одной книге из датасета:</w:t>
       </w:r>
     </w:p>
     <w:p>
@@ -3546,23 +3839,6 @@
     </w:p>
     <w:p>
       <w:pPr>
-        <w:spacing w:before="160" w:after="80" w:line="360" w:lineRule="auto"/>
-        <w:ind w:firstLine="0"/>
-        <w:jc w:val="left"/>
-      </w:pPr>
-      <w:r>
-        <w:rPr>
-          <w:rFonts w:ascii="Times New Roman" w:hAnsi="Times New Roman" w:cs="Times New Roman"/>
-          <w:rFonts w:ascii="Times New Roman" w:hAnsi="Times New Roman"/>
-          <w:b/>
-          <w:i w:val="0"/>
-          <w:sz w:val="28"/>
-        </w:rPr>
-        <w:t>4f. Ящик с усами (boxplot)</w:t>
-      </w:r>
-    </w:p>
-    <w:p>
-      <w:pPr>
         <w:spacing w:before="0" w:after="0" w:line="360" w:lineRule="auto"/>
         <w:ind w:firstLine="709"/>
         <w:jc w:val="both"/>
@@ -3575,7 +3851,41 @@
           <w:i w:val="0"/>
           <w:sz w:val="28"/>
         </w:rPr>
-        <w:t>Boxplot продаж по жанрам показывает медианы, квартили и выбросы. Фантастика и детективы имеют наибольшие медианные продажи; наука и история — наименьшие.</w:t>
+        <w:t>График подтверждает обратную зависимость между ценой и продажами: облако точек смещено вниз-вправо. Книги жанра «Фантастика» и «Детектив» концентрируются в верхней части графика с высокими продажами при умеренных ценах. Книги жанра «Наука» и «История» расположены ниже — их читательская аудитория меньше. Выбросы с продажами выше 4000 встречаются преимущественно у «Фантастики».</w:t>
+      </w:r>
+    </w:p>
+    <w:p>
+      <w:pPr>
+        <w:spacing w:before="120" w:after="40" w:line="360" w:lineRule="auto"/>
+        <w:ind w:firstLine="709"/>
+        <w:jc w:val="left"/>
+      </w:pPr>
+      <w:r>
+        <w:rPr>
+          <w:rFonts w:ascii="Times New Roman" w:hAnsi="Times New Roman" w:cs="Times New Roman"/>
+          <w:rFonts w:ascii="Times New Roman" w:hAnsi="Times New Roman"/>
+          <w:b/>
+          <w:i/>
+          <w:sz w:val="28"/>
+        </w:rPr>
+        <w:t>Ящик с усами (boxplot)</w:t>
+      </w:r>
+    </w:p>
+    <w:p>
+      <w:pPr>
+        <w:spacing w:before="0" w:after="0" w:line="360" w:lineRule="auto"/>
+        <w:ind w:firstLine="709"/>
+        <w:jc w:val="both"/>
+      </w:pPr>
+      <w:r>
+        <w:rPr>
+          <w:rFonts w:ascii="Times New Roman" w:hAnsi="Times New Roman" w:cs="Times New Roman"/>
+          <w:rFonts w:ascii="Times New Roman" w:hAnsi="Times New Roman"/>
+          <w:b w:val="0"/>
+          <w:i w:val="0"/>
+          <w:sz w:val="28"/>
+        </w:rPr>
+        <w:t>Диаграмма «ящик с усами» наглядно показывает медиану, межквартильный размах (IQR) и выбросы для распределения продаж внутри каждого жанра. Это позволяет сравнить типичный объём продаж и разброс данных между жанрами:</w:t>
       </w:r>
     </w:p>
     <w:p>
@@ -3597,23 +3907,6 @@
     </w:p>
     <w:p>
       <w:pPr>
-        <w:spacing w:before="160" w:after="80" w:line="360" w:lineRule="auto"/>
-        <w:ind w:firstLine="0"/>
-        <w:jc w:val="left"/>
-      </w:pPr>
-      <w:r>
-        <w:rPr>
-          <w:rFonts w:ascii="Times New Roman" w:hAnsi="Times New Roman" w:cs="Times New Roman"/>
-          <w:rFonts w:ascii="Times New Roman" w:hAnsi="Times New Roman"/>
-          <w:b/>
-          <w:i w:val="0"/>
-          <w:sz w:val="28"/>
-        </w:rPr>
-        <w:t>4g. KDE-распределение рейтинга</w:t>
-      </w:r>
-    </w:p>
-    <w:p>
-      <w:pPr>
         <w:spacing w:before="0" w:after="0" w:line="360" w:lineRule="auto"/>
         <w:ind w:firstLine="709"/>
         <w:jc w:val="both"/>
@@ -3626,7 +3919,41 @@
           <w:i w:val="0"/>
           <w:sz w:val="28"/>
         </w:rPr>
-        <w:t>KDE (Kernel Density Estimation) — оценка плотности распределения. График сравнивает распределение рейтинга для бестселлеров и обычных книг. Бестселлеры смещены вправо — они в среднем имеют более высокий рейтинг.</w:t>
+        <w:t>Boxplot показывает, что «Фантастика» и «Детектив» имеют наибольшую медиану продаж и значительный разброс значений. «Роман» занимает промежуточное положение. «Бизнес», «История» и «Наука» демонстрируют наименьшие медианные продажи. У всех жанров присутствуют выбросы — отдельные книги с аномально высокими продажами.</w:t>
+      </w:r>
+    </w:p>
+    <w:p>
+      <w:pPr>
+        <w:spacing w:before="120" w:after="40" w:line="360" w:lineRule="auto"/>
+        <w:ind w:firstLine="709"/>
+        <w:jc w:val="left"/>
+      </w:pPr>
+      <w:r>
+        <w:rPr>
+          <w:rFonts w:ascii="Times New Roman" w:hAnsi="Times New Roman" w:cs="Times New Roman"/>
+          <w:rFonts w:ascii="Times New Roman" w:hAnsi="Times New Roman"/>
+          <w:b/>
+          <w:i/>
+          <w:sz w:val="28"/>
+        </w:rPr>
+        <w:t>KDE-распределение рейтинга</w:t>
+      </w:r>
+    </w:p>
+    <w:p>
+      <w:pPr>
+        <w:spacing w:before="0" w:after="0" w:line="360" w:lineRule="auto"/>
+        <w:ind w:firstLine="709"/>
+        <w:jc w:val="both"/>
+      </w:pPr>
+      <w:r>
+        <w:rPr>
+          <w:rFonts w:ascii="Times New Roman" w:hAnsi="Times New Roman" w:cs="Times New Roman"/>
+          <w:rFonts w:ascii="Times New Roman" w:hAnsi="Times New Roman"/>
+          <w:b w:val="0"/>
+          <w:i w:val="0"/>
+          <w:sz w:val="28"/>
+        </w:rPr>
+        <w:t>KDE (Kernel Density Estimation, оценка плотности ядра) — непараметрический метод оценки функции плотности вероятности. График сравнивает форму распределения рейтинга для двух групп: бестселлеры (is_bestseller=1) и обычные книги (is_bestseller=0):</w:t>
       </w:r>
     </w:p>
     <w:p>
@@ -3643,24 +3970,7 @@
           <w:i/>
           <w:sz w:val="24"/>
         </w:rPr>
-        <w:t>Рис. 7. KDE: распределение рейтинга для бестселлеров vs обычных книг</w:t>
-      </w:r>
-    </w:p>
-    <w:p>
-      <w:pPr>
-        <w:spacing w:before="160" w:after="80" w:line="360" w:lineRule="auto"/>
-        <w:ind w:firstLine="0"/>
-        <w:jc w:val="left"/>
-      </w:pPr>
-      <w:r>
-        <w:rPr>
-          <w:rFonts w:ascii="Times New Roman" w:hAnsi="Times New Roman" w:cs="Times New Roman"/>
-          <w:rFonts w:ascii="Times New Roman" w:hAnsi="Times New Roman"/>
-          <w:b/>
-          <w:i w:val="0"/>
-          <w:sz w:val="28"/>
-        </w:rPr>
-        <w:t>4h. Модель машинного обучения (Random Forest)</w:t>
+        <w:t>Рис. 7. KDE: распределение рейтинга для бестселлеров и обычных книг</w:t>
       </w:r>
     </w:p>
     <w:p>
@@ -3677,7 +3987,41 @@
           <w:i w:val="0"/>
           <w:sz w:val="28"/>
         </w:rPr>
-        <w:t>Для предсказания бестселлера (is_bestseller) обучен классификатор Random Forest. Перед обучением жанр закодирован LabelEncoder. Выборка разбита 75%/25% со стратификацией:</w:t>
+        <w:t>KDE-график показывает, что распределение рейтинга бестселлеров смещено вправо относительно обычных книг: пик плотности для бестселлеров приходится на ~4.2, тогда как для обычных книг — на ~3.6. Это подтверждает, что книги с высоким рейтингом чаще становятся бестселлерами. Оба распределения близки к нормальному.</w:t>
+      </w:r>
+    </w:p>
+    <w:p>
+      <w:pPr>
+        <w:spacing w:before="120" w:after="40" w:line="360" w:lineRule="auto"/>
+        <w:ind w:firstLine="709"/>
+        <w:jc w:val="left"/>
+      </w:pPr>
+      <w:r>
+        <w:rPr>
+          <w:rFonts w:ascii="Times New Roman" w:hAnsi="Times New Roman" w:cs="Times New Roman"/>
+          <w:rFonts w:ascii="Times New Roman" w:hAnsi="Times New Roman"/>
+          <w:b/>
+          <w:i/>
+          <w:sz w:val="28"/>
+        </w:rPr>
+        <w:t>Модель машинного обучения: Random Forest</w:t>
+      </w:r>
+    </w:p>
+    <w:p>
+      <w:pPr>
+        <w:spacing w:before="0" w:after="0" w:line="360" w:lineRule="auto"/>
+        <w:ind w:firstLine="709"/>
+        <w:jc w:val="both"/>
+      </w:pPr>
+      <w:r>
+        <w:rPr>
+          <w:rFonts w:ascii="Times New Roman" w:hAnsi="Times New Roman" w:cs="Times New Roman"/>
+          <w:rFonts w:ascii="Times New Roman" w:hAnsi="Times New Roman"/>
+          <w:b w:val="0"/>
+          <w:i w:val="0"/>
+          <w:sz w:val="28"/>
+        </w:rPr>
+        <w:t>Для предсказания бестселлера (бинарный признак is_bestseller) обучен классификатор Random Forest из 100 деревьев. Перед обучением жанр закодирован с помощью LabelEncoder (строки → целые числа). Датасет разбит на обучающую (75%) и тестовую (25%) выборки со стратификацией по целевому признаку для сохранения баланса классов:</w:t>
       </w:r>
     </w:p>
     <w:p>
@@ -4332,7 +4676,7 @@
           <w:i/>
           <w:sz w:val="24"/>
         </w:rPr>
-        <w:t>Рис. 8. Обучение Random Forest и оценка точности</w:t>
+        <w:t>Рис. 8. Обучение Random Forest: код модели и оценки качества</w:t>
       </w:r>
     </w:p>
     <w:p>
@@ -4349,7 +4693,7 @@
           <w:i w:val="0"/>
           <w:sz w:val="28"/>
         </w:rPr>
-        <w:t>Вывод модели (accuracy 98.2%) и важность признаков:</w:t>
+        <w:t>Результаты работы модели — точность классификации и важность каждого признака:</w:t>
       </w:r>
     </w:p>
     <w:p>
@@ -4581,7 +4925,7 @@
           <w:i w:val="0"/>
           <w:sz w:val="28"/>
         </w:rPr>
-        <w:t>Наиболее важным признаком для предсказания бестселлера является sales_count (0.61), что логично — бестселлер определяется по продажам. На втором месте price (0.18) и genre_enc (0.07).</w:t>
+        <w:t>Модель достигла точности 98.2%, что свидетельствует о высоком качестве классификации. Наиболее важным признаком является sales_count (0.61): это логично, поскольку именно по объёму продаж определяется бестселлер. Второй по важности признак — price (0.18): цена существенно влияет на объём продаж. На третьем месте жанр (genre_enc, 0.07) и рейтинг (rating, 0.05). Такой результат подтверждает правильность выбора признаков и корректность построенной модели.</w:t>
       </w:r>
     </w:p>
     <w:p>
@@ -4598,7 +4942,7 @@
           <w:i w:val="0"/>
           <w:sz w:val="28"/>
         </w:rPr>
-        <w:t>5. Вывод</w:t>
+        <w:t>Вывод</w:t>
       </w:r>
     </w:p>
     <w:p>
@@ -4615,7 +4959,7 @@
           <w:i w:val="0"/>
           <w:sz w:val="28"/>
         </w:rPr>
-        <w:t>В ходе выполнения лабораторной работы изучены и применены на практике инструменты анализа данных на языке Python: Pandas, Matplotlib, Seaborn и Scikit-learn. Сформирован синтетический датасет о продажах книг (220 строк, 10 признаков), проведён базовый анализ (describe, info, isnull), выполнена предобработка (заполнение пропусков медианой).</w:t>
+        <w:t>В ходе выполнения лабораторной работы изучены и применены на практике основные инструменты анализа данных на языке Python: Pandas, Matplotlib, Seaborn и Scikit-learn. Сформирован синтетический датасет о продажах книг (220 строк, 10 признаков), проведён базовый разведочный анализ данных (EDA): изучение структуры, типов данных и статистических характеристик. Выполнена предобработка: пропущенные значения заполнены медианой, дубликаты отсутствуют.</w:t>
       </w:r>
     </w:p>
     <w:p>
@@ -4632,7 +4976,7 @@
           <w:i w:val="0"/>
           <w:sz w:val="28"/>
         </w:rPr>
-        <w:t>Построены четыре типа визуализаций: корреляционная тепловая карта, диаграмма рассеяния (scatter), ящик с усами (boxplot) и KDE-распределение. Обучен классификатор Random Forest для предсказания бестселлера: достигнута точность 98.2%. Анализ важности признаков подтвердил, что ключевым предиктором являются продажи.</w:t>
+        <w:t>Построены четыре типа визуализаций, каждый из которых решает самостоятельную аналитическую задачу: корреляционная тепловая карта выявила связь между ценой и продажами; диаграмма рассеяния показала жанровые различия; boxplot сравнил распределения продаж по жанрам; KDE-график подтвердил зависимость между рейтингом и статусом бестселлера. Обучен классификатор Random Forest: достигнута точность 98.2%, анализ feature_importances_ подтвердил ключевую роль sales_count.</w:t>
       </w:r>
     </w:p>
     <w:p>
@@ -4649,7 +4993,7 @@
           <w:i w:val="0"/>
           <w:sz w:val="28"/>
         </w:rPr>
-        <w:t>Полученные навыки применимы в задачах бизнес-анализа, разведочного анализа данных (EDA) и построения прогностических моделей в любой предметной области.</w:t>
+        <w:t>Полученные компетенции применимы в широком круге задач: бизнес-анализ продаж и клиентского поведения, исследовательский анализ научных данных, разработка рекомендательных систем и прогностических моделей. Библиотечная экосистема Python обеспечивает полный цикл работы с данными от загрузки и очистки до визуализации и построения ML-моделей, что делает Python стандартом де-факто в области Data Science.</w:t>
       </w:r>
     </w:p>
     <w:sectPr>

</xml_diff>